<commit_message>
modified some pages in the report
</commit_message>
<xml_diff>
--- a/ReportTowerDefenseProject.docx
+++ b/ReportTowerDefenseProject.docx
@@ -337,7 +337,7 @@
         <w:spacing w:before="240" w:line="240" w:lineRule="auto"/>
         <w:jc w:val="both"/>
         <w:rPr>
-          <w:rFonts w:ascii="TH Sarabun New" w:hAnsi="TH Sarabun New" w:cs="TH Sarabun New" w:hint="cs"/>
+          <w:rFonts w:ascii="TH Sarabun New" w:hAnsi="TH Sarabun New" w:cs="TH Sarabun New"/>
           <w:b/>
           <w:bCs/>
           <w:sz w:val="28"/>
@@ -9074,6 +9074,7 @@
       <w:r>
         <w:rPr>
           <w:rFonts w:ascii="TH Sarabun New" w:hAnsi="TH Sarabun New" w:cs="TH Sarabun New"/>
+          <w:noProof/>
           <w:sz w:val="28"/>
           <w:szCs w:val="28"/>
         </w:rPr>
@@ -9116,6 +9117,7 @@
       <w:r>
         <w:rPr>
           <w:rFonts w:ascii="TH Sarabun New" w:hAnsi="TH Sarabun New" w:cs="TH Sarabun New"/>
+          <w:noProof/>
           <w:sz w:val="28"/>
           <w:szCs w:val="28"/>
         </w:rPr>
@@ -9168,7 +9170,7 @@
     <w:p>
       <w:pPr>
         <w:rPr>
-          <w:rFonts w:ascii="TH Sarabun New" w:hAnsi="TH Sarabun New" w:cs="TH Sarabun New" w:hint="cs"/>
+          <w:rFonts w:ascii="TH Sarabun New" w:hAnsi="TH Sarabun New" w:cs="TH Sarabun New"/>
           <w:b/>
           <w:bCs/>
           <w:sz w:val="32"/>
@@ -16827,15 +16829,7 @@
           <w:sz w:val="28"/>
           <w:szCs w:val="28"/>
         </w:rPr>
-        <w:t>Centralized texture preloading with AssetManager (environment, towers, projectiles, enemies).</w:t>
-      </w:r>
-      <w:r>
-        <w:rPr>
-          <w:rFonts w:ascii="TH Sarabun New" w:hAnsi="TH Sarabun New" w:cs="TH Sarabun New"/>
-          <w:sz w:val="28"/>
-          <w:szCs w:val="28"/>
-        </w:rPr>
-        <w:t xml:space="preserve"> </w:t>
+        <w:t xml:space="preserve">Centralized texture preloading with AssetManager (environment, towers, projectiles, enemies). </w:t>
       </w:r>
     </w:p>
     <w:p>
@@ -17814,15 +17808,7 @@
           <w:sz w:val="28"/>
           <w:szCs w:val="28"/>
         </w:rPr>
-        <w:t>abstract</w:t>
-      </w:r>
-      <w:r>
-        <w:rPr>
-          <w:rFonts w:ascii="TH Sarabun New" w:hAnsi="TH Sarabun New" w:cs="TH Sarabun New"/>
-          <w:sz w:val="28"/>
-          <w:szCs w:val="28"/>
-        </w:rPr>
-        <w:t xml:space="preserve"> </w:t>
+        <w:t xml:space="preserve">abstract </w:t>
       </w:r>
       <w:r>
         <w:rPr>
@@ -17886,27 +17872,6 @@
       <w:r>
         <w:rPr>
           <w:rFonts w:ascii="TH Sarabun New" w:hAnsi="TH Sarabun New" w:cs="TH Sarabun New"/>
-          <w:color w:val="7030A0"/>
-          <w:sz w:val="28"/>
-          <w:szCs w:val="28"/>
-        </w:rPr>
-        <w:t>Code example</w:t>
-      </w:r>
-    </w:p>
-    <w:p>
-      <w:pPr>
-        <w:pStyle w:val="ListParagraph"/>
-        <w:spacing w:after="0" w:line="240" w:lineRule="auto"/>
-        <w:jc w:val="both"/>
-        <w:rPr>
-          <w:rFonts w:ascii="TH Sarabun New" w:hAnsi="TH Sarabun New" w:cs="TH Sarabun New"/>
-          <w:sz w:val="16"/>
-          <w:szCs w:val="16"/>
-        </w:rPr>
-      </w:pPr>
-      <w:r>
-        <w:rPr>
-          <w:rFonts w:ascii="TH Sarabun New" w:hAnsi="TH Sarabun New" w:cs="TH Sarabun New"/>
           <w:noProof/>
           <w:sz w:val="16"/>
           <w:szCs w:val="16"/>
@@ -17914,15 +17879,15 @@
         <mc:AlternateContent>
           <mc:Choice Requires="wpg">
             <w:drawing>
-              <wp:anchor distT="0" distB="0" distL="114300" distR="114300" simplePos="0" relativeHeight="251828224" behindDoc="1" locked="0" layoutInCell="1" allowOverlap="1" wp14:anchorId="347C5C9A" wp14:editId="34F616AC">
+              <wp:anchor distT="0" distB="0" distL="114300" distR="114300" simplePos="0" relativeHeight="251828224" behindDoc="1" locked="0" layoutInCell="1" allowOverlap="1" wp14:anchorId="347C5C9A" wp14:editId="1BB1154E">
                 <wp:simplePos x="0" y="0"/>
                 <wp:positionH relativeFrom="column">
-                  <wp:posOffset>20548</wp:posOffset>
+                  <wp:posOffset>20320</wp:posOffset>
                 </wp:positionH>
                 <wp:positionV relativeFrom="paragraph">
-                  <wp:posOffset>73646</wp:posOffset>
+                  <wp:posOffset>218601</wp:posOffset>
                 </wp:positionV>
-                <wp:extent cx="5815173" cy="865505"/>
+                <wp:extent cx="5814695" cy="865505"/>
                 <wp:effectExtent l="0" t="0" r="0" b="0"/>
                 <wp:wrapNone/>
                 <wp:docPr id="144853558" name="Group 71"/>
@@ -17934,7 +17899,7 @@
                       <wpg:grpSpPr>
                         <a:xfrm>
                           <a:off x="0" y="0"/>
-                          <a:ext cx="5815173" cy="865505"/>
+                          <a:ext cx="5814695" cy="865505"/>
                           <a:chOff x="0" y="0"/>
                           <a:chExt cx="5942965" cy="865505"/>
                         </a:xfrm>
@@ -18031,7 +17996,7 @@
           </mc:Choice>
           <mc:Fallback>
             <w:pict>
-              <v:group w14:anchorId="6DE22187" id="Group 71" o:spid="_x0000_s1026" style="position:absolute;margin-left:1.6pt;margin-top:5.8pt;width:457.9pt;height:68.15pt;z-index:-251488256;mso-width-relative:margin" coordsize="59429,8655" o:gfxdata="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">
+              <v:group w14:anchorId="20A5A91E" id="Group 71" o:spid="_x0000_s1026" style="position:absolute;margin-left:1.6pt;margin-top:17.2pt;width:457.85pt;height:68.15pt;z-index:-251488256;mso-width-relative:margin" coordsize="59429,8655" o:gfxdata="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">
                 <v:roundrect id="Rectangle: Rounded Corners 70" o:spid="_x0000_s1027" style="position:absolute;width:59429;height:8655;visibility:visible;mso-wrap-style:square;v-text-anchor:middle" arcsize="10923f" o:gfxdata="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" fillcolor="#181825" stroked="f" strokeweight="1.5pt">
                   <v:stroke joinstyle="miter"/>
                 </v:roundrect>
@@ -18043,6 +18008,27 @@
           </mc:Fallback>
         </mc:AlternateContent>
       </w:r>
+      <w:r>
+        <w:rPr>
+          <w:rFonts w:ascii="TH Sarabun New" w:hAnsi="TH Sarabun New" w:cs="TH Sarabun New"/>
+          <w:color w:val="7030A0"/>
+          <w:sz w:val="28"/>
+          <w:szCs w:val="28"/>
+        </w:rPr>
+        <w:t>Code example</w:t>
+      </w:r>
+    </w:p>
+    <w:p>
+      <w:pPr>
+        <w:pStyle w:val="ListParagraph"/>
+        <w:spacing w:after="0" w:line="240" w:lineRule="auto"/>
+        <w:jc w:val="both"/>
+        <w:rPr>
+          <w:rFonts w:ascii="TH Sarabun New" w:hAnsi="TH Sarabun New" w:cs="TH Sarabun New"/>
+          <w:sz w:val="4"/>
+          <w:szCs w:val="4"/>
+        </w:rPr>
+      </w:pPr>
     </w:p>
     <w:p>
       <w:pPr>
@@ -18830,7 +18816,7 @@
         <w:spacing w:line="240" w:lineRule="auto"/>
         <w:jc w:val="both"/>
         <w:rPr>
-          <w:rFonts w:ascii="TH Sarabun New" w:hAnsi="TH Sarabun New" w:cs="TH Sarabun New" w:hint="cs"/>
+          <w:rFonts w:ascii="TH Sarabun New" w:hAnsi="TH Sarabun New" w:cs="TH Sarabun New"/>
           <w:sz w:val="28"/>
           <w:szCs w:val="28"/>
         </w:rPr>
@@ -18945,26 +18931,6 @@
       <w:r>
         <w:rPr>
           <w:rFonts w:ascii="TH Sarabun New" w:hAnsi="TH Sarabun New" w:cs="TH Sarabun New"/>
-          <w:color w:val="7030A0"/>
-          <w:sz w:val="28"/>
-          <w:szCs w:val="28"/>
-        </w:rPr>
-        <w:t>Code example</w:t>
-      </w:r>
-    </w:p>
-    <w:p>
-      <w:pPr>
-        <w:spacing w:after="0" w:line="240" w:lineRule="auto"/>
-        <w:jc w:val="both"/>
-        <w:rPr>
-          <w:rFonts w:ascii="TH Sarabun New" w:hAnsi="TH Sarabun New" w:cs="TH Sarabun New"/>
-          <w:sz w:val="16"/>
-          <w:szCs w:val="16"/>
-        </w:rPr>
-      </w:pPr>
-      <w:r>
-        <w:rPr>
-          <w:rFonts w:ascii="TH Sarabun New" w:hAnsi="TH Sarabun New" w:cs="TH Sarabun New"/>
           <w:noProof/>
           <w:sz w:val="16"/>
           <w:szCs w:val="16"/>
@@ -18972,15 +18938,15 @@
         <mc:AlternateContent>
           <mc:Choice Requires="wpg">
             <w:drawing>
-              <wp:anchor distT="0" distB="0" distL="114300" distR="114300" simplePos="0" relativeHeight="251830272" behindDoc="1" locked="0" layoutInCell="1" allowOverlap="1" wp14:anchorId="47C7EA21" wp14:editId="7508592E">
+              <wp:anchor distT="0" distB="0" distL="114300" distR="114300" simplePos="0" relativeHeight="251830272" behindDoc="1" locked="0" layoutInCell="1" allowOverlap="1" wp14:anchorId="47C7EA21" wp14:editId="58EB66DB">
                 <wp:simplePos x="0" y="0"/>
                 <wp:positionH relativeFrom="column">
-                  <wp:posOffset>21600</wp:posOffset>
+                  <wp:posOffset>20955</wp:posOffset>
                 </wp:positionH>
                 <wp:positionV relativeFrom="paragraph">
-                  <wp:posOffset>64645</wp:posOffset>
+                  <wp:posOffset>229074</wp:posOffset>
                 </wp:positionV>
-                <wp:extent cx="5814695" cy="1180660"/>
+                <wp:extent cx="5814695" cy="1180465"/>
                 <wp:effectExtent l="0" t="0" r="0" b="635"/>
                 <wp:wrapNone/>
                 <wp:docPr id="1397957376" name="Group 71"/>
@@ -18992,7 +18958,7 @@
                       <wpg:grpSpPr>
                         <a:xfrm>
                           <a:off x="0" y="0"/>
-                          <a:ext cx="5814695" cy="1180660"/>
+                          <a:ext cx="5814695" cy="1180465"/>
                           <a:chOff x="0" y="0"/>
                           <a:chExt cx="5942965" cy="865505"/>
                         </a:xfrm>
@@ -19092,7 +19058,7 @@
           </mc:Choice>
           <mc:Fallback>
             <w:pict>
-              <v:group w14:anchorId="27379F77" id="Group 71" o:spid="_x0000_s1026" style="position:absolute;margin-left:1.7pt;margin-top:5.1pt;width:457.85pt;height:92.95pt;z-index:-251486208;mso-width-relative:margin;mso-height-relative:margin" coordsize="59429,8655" o:gfxdata="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">
+              <v:group w14:anchorId="48701128" id="Group 71" o:spid="_x0000_s1026" style="position:absolute;margin-left:1.65pt;margin-top:18.05pt;width:457.85pt;height:92.95pt;z-index:-251486208;mso-width-relative:margin;mso-height-relative:margin" coordsize="59429,8655" o:gfxdata="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">
                 <v:roundrect id="Rectangle: Rounded Corners 70" o:spid="_x0000_s1027" style="position:absolute;width:59429;height:8655;visibility:visible;mso-wrap-style:square;v-text-anchor:middle" arcsize="10923f" o:gfxdata="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" fillcolor="#181825" stroked="f" strokeweight="1.5pt">
                   <v:stroke joinstyle="miter"/>
                 </v:roundrect>
@@ -19104,6 +19070,26 @@
           </mc:Fallback>
         </mc:AlternateContent>
       </w:r>
+      <w:r>
+        <w:rPr>
+          <w:rFonts w:ascii="TH Sarabun New" w:hAnsi="TH Sarabun New" w:cs="TH Sarabun New"/>
+          <w:color w:val="7030A0"/>
+          <w:sz w:val="28"/>
+          <w:szCs w:val="28"/>
+        </w:rPr>
+        <w:t>Code example</w:t>
+      </w:r>
+    </w:p>
+    <w:p>
+      <w:pPr>
+        <w:spacing w:after="0" w:line="240" w:lineRule="auto"/>
+        <w:jc w:val="both"/>
+        <w:rPr>
+          <w:rFonts w:ascii="TH Sarabun New" w:hAnsi="TH Sarabun New" w:cs="TH Sarabun New"/>
+          <w:sz w:val="4"/>
+          <w:szCs w:val="4"/>
+        </w:rPr>
+      </w:pPr>
     </w:p>
     <w:p>
       <w:pPr>
@@ -19615,27 +19601,6 @@
       <w:r>
         <w:rPr>
           <w:rFonts w:ascii="TH Sarabun New" w:hAnsi="TH Sarabun New" w:cs="TH Sarabun New"/>
-          <w:color w:val="7030A0"/>
-          <w:sz w:val="28"/>
-          <w:szCs w:val="28"/>
-        </w:rPr>
-        <w:t>Code example</w:t>
-      </w:r>
-    </w:p>
-    <w:p>
-      <w:pPr>
-        <w:spacing w:after="0" w:line="240" w:lineRule="auto"/>
-        <w:ind w:left="360"/>
-        <w:jc w:val="both"/>
-        <w:rPr>
-          <w:rFonts w:ascii="TH Sarabun New" w:hAnsi="TH Sarabun New" w:cs="TH Sarabun New"/>
-          <w:sz w:val="16"/>
-          <w:szCs w:val="16"/>
-        </w:rPr>
-      </w:pPr>
-      <w:r>
-        <w:rPr>
-          <w:rFonts w:ascii="TH Sarabun New" w:hAnsi="TH Sarabun New" w:cs="TH Sarabun New"/>
           <w:noProof/>
           <w:sz w:val="16"/>
           <w:szCs w:val="16"/>
@@ -19643,15 +19608,15 @@
         <mc:AlternateContent>
           <mc:Choice Requires="wpg">
             <w:drawing>
-              <wp:anchor distT="0" distB="0" distL="114300" distR="114300" simplePos="0" relativeHeight="251834368" behindDoc="1" locked="0" layoutInCell="1" allowOverlap="1" wp14:anchorId="1CD324DB" wp14:editId="31584E9B">
+              <wp:anchor distT="0" distB="0" distL="114300" distR="114300" simplePos="0" relativeHeight="251834368" behindDoc="1" locked="0" layoutInCell="1" allowOverlap="1" wp14:anchorId="1CD324DB" wp14:editId="737957FB">
                 <wp:simplePos x="0" y="0"/>
                 <wp:positionH relativeFrom="column">
-                  <wp:posOffset>21600</wp:posOffset>
+                  <wp:posOffset>21590</wp:posOffset>
                 </wp:positionH>
                 <wp:positionV relativeFrom="paragraph">
-                  <wp:posOffset>106775</wp:posOffset>
+                  <wp:posOffset>223359</wp:posOffset>
                 </wp:positionV>
-                <wp:extent cx="5814695" cy="539300"/>
+                <wp:extent cx="5814695" cy="539115"/>
                 <wp:effectExtent l="0" t="0" r="0" b="0"/>
                 <wp:wrapNone/>
                 <wp:docPr id="938132732" name="Group 71"/>
@@ -19663,7 +19628,7 @@
                       <wpg:grpSpPr>
                         <a:xfrm>
                           <a:off x="0" y="0"/>
-                          <a:ext cx="5814695" cy="539300"/>
+                          <a:ext cx="5814695" cy="539115"/>
                           <a:chOff x="0" y="0"/>
                           <a:chExt cx="5942965" cy="865505"/>
                         </a:xfrm>
@@ -19763,7 +19728,7 @@
           </mc:Choice>
           <mc:Fallback>
             <w:pict>
-              <v:group w14:anchorId="22DC881C" id="Group 71" o:spid="_x0000_s1026" style="position:absolute;margin-left:1.7pt;margin-top:8.4pt;width:457.85pt;height:42.45pt;z-index:-251482112;mso-width-relative:margin;mso-height-relative:margin" coordsize="59429,8655" o:gfxdata="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">
+              <v:group w14:anchorId="748CE867" id="Group 71" o:spid="_x0000_s1026" style="position:absolute;margin-left:1.7pt;margin-top:17.6pt;width:457.85pt;height:42.45pt;z-index:-251482112;mso-width-relative:margin;mso-height-relative:margin" coordsize="59429,8655" o:gfxdata="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">
                 <v:roundrect id="Rectangle: Rounded Corners 70" o:spid="_x0000_s1027" style="position:absolute;width:59429;height:8655;visibility:visible;mso-wrap-style:square;v-text-anchor:middle" arcsize="10923f" o:gfxdata="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" fillcolor="#181825" stroked="f" strokeweight="1.5pt">
                   <v:stroke joinstyle="miter"/>
                 </v:roundrect>
@@ -19775,6 +19740,36 @@
           </mc:Fallback>
         </mc:AlternateContent>
       </w:r>
+      <w:r>
+        <w:rPr>
+          <w:rFonts w:ascii="TH Sarabun New" w:hAnsi="TH Sarabun New" w:cs="TH Sarabun New"/>
+          <w:color w:val="7030A0"/>
+          <w:sz w:val="28"/>
+          <w:szCs w:val="28"/>
+        </w:rPr>
+        <w:t>Code example</w:t>
+      </w:r>
+    </w:p>
+    <w:p>
+      <w:pPr>
+        <w:spacing w:after="0" w:line="240" w:lineRule="auto"/>
+        <w:jc w:val="both"/>
+        <w:rPr>
+          <w:rFonts w:ascii="TH Sarabun New" w:hAnsi="TH Sarabun New" w:cs="TH Sarabun New"/>
+          <w:color w:val="7030A0"/>
+          <w:sz w:val="28"/>
+          <w:szCs w:val="28"/>
+        </w:rPr>
+      </w:pPr>
+      <w:r>
+        <w:rPr>
+          <w:rFonts w:ascii="TH Sarabun New" w:hAnsi="TH Sarabun New" w:cs="TH Sarabun New"/>
+          <w:color w:val="7030A0"/>
+          <w:sz w:val="4"/>
+          <w:szCs w:val="4"/>
+        </w:rPr>
+        <w:t xml:space="preserve">                                        o</w:t>
+      </w:r>
     </w:p>
     <w:p>
       <w:pPr>
@@ -19964,15 +19959,15 @@
         <mc:AlternateContent>
           <mc:Choice Requires="wpg">
             <w:drawing>
-              <wp:anchor distT="0" distB="0" distL="114300" distR="114300" simplePos="0" relativeHeight="251832320" behindDoc="1" locked="0" layoutInCell="1" allowOverlap="1" wp14:anchorId="711BD46B" wp14:editId="7AC2FE04">
+              <wp:anchor distT="0" distB="0" distL="114300" distR="114300" simplePos="0" relativeHeight="251832320" behindDoc="1" locked="0" layoutInCell="1" allowOverlap="1" wp14:anchorId="711BD46B" wp14:editId="4813CC9C">
                 <wp:simplePos x="0" y="0"/>
                 <wp:positionH relativeFrom="column">
                   <wp:posOffset>20320</wp:posOffset>
                 </wp:positionH>
                 <wp:positionV relativeFrom="paragraph">
-                  <wp:posOffset>101520</wp:posOffset>
+                  <wp:posOffset>82076</wp:posOffset>
                 </wp:positionV>
-                <wp:extent cx="5815173" cy="865505"/>
+                <wp:extent cx="5815173" cy="689212"/>
                 <wp:effectExtent l="0" t="0" r="0" b="0"/>
                 <wp:wrapNone/>
                 <wp:docPr id="390755459" name="Group 71"/>
@@ -19984,7 +19979,7 @@
                       <wpg:grpSpPr>
                         <a:xfrm>
                           <a:off x="0" y="0"/>
-                          <a:ext cx="5815173" cy="865505"/>
+                          <a:ext cx="5815173" cy="689212"/>
                           <a:chOff x="0" y="0"/>
                           <a:chExt cx="5942965" cy="865505"/>
                         </a:xfrm>
@@ -20076,12 +20071,15 @@
                 <wp14:sizeRelH relativeFrom="margin">
                   <wp14:pctWidth>0</wp14:pctWidth>
                 </wp14:sizeRelH>
+                <wp14:sizeRelV relativeFrom="margin">
+                  <wp14:pctHeight>0</wp14:pctHeight>
+                </wp14:sizeRelV>
               </wp:anchor>
             </w:drawing>
           </mc:Choice>
           <mc:Fallback>
             <w:pict>
-              <v:group w14:anchorId="36ACDEBB" id="Group 71" o:spid="_x0000_s1026" style="position:absolute;margin-left:1.6pt;margin-top:8pt;width:457.9pt;height:68.15pt;z-index:-251484160;mso-width-relative:margin" coordsize="59429,8655" o:gfxdata="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">
+              <v:group w14:anchorId="45E6ACAF" id="Group 71" o:spid="_x0000_s1026" style="position:absolute;margin-left:1.6pt;margin-top:6.45pt;width:457.9pt;height:54.25pt;z-index:-251484160;mso-width-relative:margin;mso-height-relative:margin" coordsize="59429,8655" o:gfxdata="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">
                 <v:roundrect id="Rectangle: Rounded Corners 70" o:spid="_x0000_s1027" style="position:absolute;width:59429;height:8655;visibility:visible;mso-wrap-style:square;v-text-anchor:middle" arcsize="10923f" o:gfxdata="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" fillcolor="#181825" stroked="f" strokeweight="1.5pt">
                   <v:stroke joinstyle="miter"/>
                 </v:roundrect>
@@ -20102,6 +20100,8 @@
         <w:rPr>
           <w:rFonts w:ascii="Consolas" w:hAnsi="Consolas"/>
           <w:color w:val="CDD6F4"/>
+          <w:sz w:val="19"/>
+          <w:szCs w:val="19"/>
         </w:rPr>
       </w:pPr>
       <w:r>
@@ -20109,6 +20109,8 @@
           <w:rStyle w:val="pl-c1"/>
           <w:rFonts w:ascii="Consolas" w:hAnsi="Consolas"/>
           <w:color w:val="89B4FA"/>
+          <w:sz w:val="19"/>
+          <w:szCs w:val="19"/>
         </w:rPr>
         <w:t>@Override</w:t>
       </w:r>
@@ -20121,6 +20123,8 @@
         <w:rPr>
           <w:rFonts w:ascii="Consolas" w:hAnsi="Consolas"/>
           <w:color w:val="CDD6F4"/>
+          <w:sz w:val="19"/>
+          <w:szCs w:val="19"/>
         </w:rPr>
       </w:pPr>
       <w:r>
@@ -20128,6 +20132,8 @@
           <w:rStyle w:val="pl-k"/>
           <w:rFonts w:ascii="Consolas" w:hAnsi="Consolas"/>
           <w:color w:val="CBA6F7"/>
+          <w:sz w:val="19"/>
+          <w:szCs w:val="19"/>
         </w:rPr>
         <w:t>public</w:t>
       </w:r>
@@ -20135,6 +20141,8 @@
         <w:rPr>
           <w:rFonts w:ascii="Consolas" w:hAnsi="Consolas"/>
           <w:color w:val="CDD6F4"/>
+          <w:sz w:val="19"/>
+          <w:szCs w:val="19"/>
         </w:rPr>
         <w:t xml:space="preserve"> </w:t>
       </w:r>
@@ -20143,6 +20151,8 @@
           <w:rStyle w:val="pl-smi"/>
           <w:rFonts w:ascii="Consolas" w:hAnsi="Consolas"/>
           <w:color w:val="FAB387"/>
+          <w:sz w:val="19"/>
+          <w:szCs w:val="19"/>
         </w:rPr>
         <w:t>void</w:t>
       </w:r>
@@ -20150,6 +20160,8 @@
         <w:rPr>
           <w:rFonts w:ascii="Consolas" w:hAnsi="Consolas"/>
           <w:color w:val="CDD6F4"/>
+          <w:sz w:val="19"/>
+          <w:szCs w:val="19"/>
         </w:rPr>
         <w:t xml:space="preserve"> </w:t>
       </w:r>
@@ -20158,6 +20170,8 @@
           <w:rStyle w:val="pl-en"/>
           <w:rFonts w:ascii="Consolas" w:hAnsi="Consolas"/>
           <w:color w:val="89B4FA"/>
+          <w:sz w:val="19"/>
+          <w:szCs w:val="19"/>
         </w:rPr>
         <w:t>update</w:t>
       </w:r>
@@ -20165,6 +20179,8 @@
         <w:rPr>
           <w:rFonts w:ascii="Consolas" w:hAnsi="Consolas"/>
           <w:color w:val="CDD6F4"/>
+          <w:sz w:val="19"/>
+          <w:szCs w:val="19"/>
         </w:rPr>
         <w:t>(</w:t>
       </w:r>
@@ -20173,6 +20189,8 @@
           <w:rStyle w:val="pl-smi"/>
           <w:rFonts w:ascii="Consolas" w:hAnsi="Consolas"/>
           <w:color w:val="FAB387"/>
+          <w:sz w:val="19"/>
+          <w:szCs w:val="19"/>
         </w:rPr>
         <w:t>List</w:t>
       </w:r>
@@ -20180,6 +20198,8 @@
         <w:rPr>
           <w:rFonts w:ascii="Consolas" w:hAnsi="Consolas"/>
           <w:color w:val="CDD6F4"/>
+          <w:sz w:val="19"/>
+          <w:szCs w:val="19"/>
         </w:rPr>
         <w:t>&lt;</w:t>
       </w:r>
@@ -20188,6 +20208,8 @@
           <w:rStyle w:val="pl-smi"/>
           <w:rFonts w:ascii="Consolas" w:hAnsi="Consolas"/>
           <w:color w:val="FAB387"/>
+          <w:sz w:val="19"/>
+          <w:szCs w:val="19"/>
         </w:rPr>
         <w:t>Enemy</w:t>
       </w:r>
@@ -20195,6 +20217,8 @@
         <w:rPr>
           <w:rFonts w:ascii="Consolas" w:hAnsi="Consolas"/>
           <w:color w:val="CDD6F4"/>
+          <w:sz w:val="19"/>
+          <w:szCs w:val="19"/>
         </w:rPr>
         <w:t xml:space="preserve">&gt; </w:t>
       </w:r>
@@ -20203,6 +20227,8 @@
           <w:rStyle w:val="pl-s1"/>
           <w:rFonts w:ascii="Consolas" w:hAnsi="Consolas"/>
           <w:color w:val="CDD6F4"/>
+          <w:sz w:val="19"/>
+          <w:szCs w:val="19"/>
         </w:rPr>
         <w:t>enemies</w:t>
       </w:r>
@@ -20210,6 +20236,8 @@
         <w:rPr>
           <w:rFonts w:ascii="Consolas" w:hAnsi="Consolas"/>
           <w:color w:val="CDD6F4"/>
+          <w:sz w:val="19"/>
+          <w:szCs w:val="19"/>
         </w:rPr>
         <w:t xml:space="preserve">, </w:t>
       </w:r>
@@ -20218,6 +20246,8 @@
           <w:rStyle w:val="pl-smi"/>
           <w:rFonts w:ascii="Consolas" w:hAnsi="Consolas"/>
           <w:color w:val="FAB387"/>
+          <w:sz w:val="19"/>
+          <w:szCs w:val="19"/>
         </w:rPr>
         <w:t>List</w:t>
       </w:r>
@@ -20225,6 +20255,8 @@
         <w:rPr>
           <w:rFonts w:ascii="Consolas" w:hAnsi="Consolas"/>
           <w:color w:val="CDD6F4"/>
+          <w:sz w:val="19"/>
+          <w:szCs w:val="19"/>
         </w:rPr>
         <w:t>&lt;</w:t>
       </w:r>
@@ -20233,6 +20265,8 @@
           <w:rStyle w:val="pl-smi"/>
           <w:rFonts w:ascii="Consolas" w:hAnsi="Consolas"/>
           <w:color w:val="FAB387"/>
+          <w:sz w:val="19"/>
+          <w:szCs w:val="19"/>
         </w:rPr>
         <w:t>Projectile</w:t>
       </w:r>
@@ -20240,6 +20274,8 @@
         <w:rPr>
           <w:rFonts w:ascii="Consolas" w:hAnsi="Consolas"/>
           <w:color w:val="CDD6F4"/>
+          <w:sz w:val="19"/>
+          <w:szCs w:val="19"/>
         </w:rPr>
         <w:t xml:space="preserve">&gt; </w:t>
       </w:r>
@@ -20248,6 +20284,8 @@
           <w:rStyle w:val="pl-s1"/>
           <w:rFonts w:ascii="Consolas" w:hAnsi="Consolas"/>
           <w:color w:val="CDD6F4"/>
+          <w:sz w:val="19"/>
+          <w:szCs w:val="19"/>
         </w:rPr>
         <w:t>activeProjectiles</w:t>
       </w:r>
@@ -20255,6 +20293,8 @@
         <w:rPr>
           <w:rFonts w:ascii="Consolas" w:hAnsi="Consolas"/>
           <w:color w:val="CDD6F4"/>
+          <w:sz w:val="19"/>
+          <w:szCs w:val="19"/>
         </w:rPr>
         <w:t>) {</w:t>
       </w:r>
@@ -20267,12 +20307,16 @@
         <w:rPr>
           <w:rFonts w:ascii="Consolas" w:hAnsi="Consolas"/>
           <w:color w:val="CDD6F4"/>
+          <w:sz w:val="19"/>
+          <w:szCs w:val="19"/>
         </w:rPr>
       </w:pPr>
       <w:r>
         <w:rPr>
           <w:rFonts w:ascii="Consolas" w:hAnsi="Consolas"/>
           <w:color w:val="CDD6F4"/>
+          <w:sz w:val="19"/>
+          <w:szCs w:val="19"/>
         </w:rPr>
         <w:t xml:space="preserve">    </w:t>
       </w:r>
@@ -20281,6 +20325,8 @@
           <w:rStyle w:val="pl-en"/>
           <w:rFonts w:ascii="Consolas" w:hAnsi="Consolas"/>
           <w:color w:val="89B4FA"/>
+          <w:sz w:val="19"/>
+          <w:szCs w:val="19"/>
         </w:rPr>
         <w:t>updateProjectileAttack</w:t>
       </w:r>
@@ -20288,6 +20334,8 @@
         <w:rPr>
           <w:rFonts w:ascii="Consolas" w:hAnsi="Consolas"/>
           <w:color w:val="CDD6F4"/>
+          <w:sz w:val="19"/>
+          <w:szCs w:val="19"/>
         </w:rPr>
         <w:t>(</w:t>
       </w:r>
@@ -20296,6 +20344,8 @@
           <w:rStyle w:val="pl-s1"/>
           <w:rFonts w:ascii="Consolas" w:hAnsi="Consolas"/>
           <w:color w:val="CDD6F4"/>
+          <w:sz w:val="19"/>
+          <w:szCs w:val="19"/>
         </w:rPr>
         <w:t>enemies</w:t>
       </w:r>
@@ -20303,6 +20353,8 @@
         <w:rPr>
           <w:rFonts w:ascii="Consolas" w:hAnsi="Consolas"/>
           <w:color w:val="CDD6F4"/>
+          <w:sz w:val="19"/>
+          <w:szCs w:val="19"/>
         </w:rPr>
         <w:t xml:space="preserve">, </w:t>
       </w:r>
@@ -20311,6 +20363,8 @@
           <w:rStyle w:val="pl-s1"/>
           <w:rFonts w:ascii="Consolas" w:hAnsi="Consolas"/>
           <w:color w:val="CDD6F4"/>
+          <w:sz w:val="19"/>
+          <w:szCs w:val="19"/>
         </w:rPr>
         <w:t>activeProjectiles</w:t>
       </w:r>
@@ -20318,6 +20372,8 @@
         <w:rPr>
           <w:rFonts w:ascii="Consolas" w:hAnsi="Consolas"/>
           <w:color w:val="CDD6F4"/>
+          <w:sz w:val="19"/>
+          <w:szCs w:val="19"/>
         </w:rPr>
         <w:t xml:space="preserve">, </w:t>
       </w:r>
@@ -20326,6 +20382,8 @@
           <w:rStyle w:val="pl-c1"/>
           <w:rFonts w:ascii="Consolas" w:hAnsi="Consolas"/>
           <w:color w:val="89B4FA"/>
+          <w:sz w:val="19"/>
+          <w:szCs w:val="19"/>
         </w:rPr>
         <w:t>CANNON_PROJECTILE_SPRITE</w:t>
       </w:r>
@@ -20333,6 +20391,8 @@
         <w:rPr>
           <w:rFonts w:ascii="Consolas" w:hAnsi="Consolas"/>
           <w:color w:val="CDD6F4"/>
+          <w:sz w:val="19"/>
+          <w:szCs w:val="19"/>
         </w:rPr>
         <w:t>);</w:t>
       </w:r>
@@ -20345,12 +20405,16 @@
         <w:rPr>
           <w:rFonts w:ascii="Consolas" w:hAnsi="Consolas"/>
           <w:color w:val="CDD6F4"/>
+          <w:sz w:val="19"/>
+          <w:szCs w:val="19"/>
         </w:rPr>
       </w:pPr>
       <w:r>
         <w:rPr>
           <w:rFonts w:ascii="Consolas" w:hAnsi="Consolas"/>
           <w:color w:val="CDD6F4"/>
+          <w:sz w:val="19"/>
+          <w:szCs w:val="19"/>
         </w:rPr>
         <w:t>}</w:t>
       </w:r>
@@ -20690,26 +20754,6 @@
       <w:r>
         <w:rPr>
           <w:rFonts w:ascii="TH Sarabun New" w:hAnsi="TH Sarabun New" w:cs="TH Sarabun New"/>
-          <w:color w:val="7030A0"/>
-          <w:sz w:val="28"/>
-          <w:szCs w:val="28"/>
-        </w:rPr>
-        <w:t>Code example</w:t>
-      </w:r>
-    </w:p>
-    <w:p>
-      <w:pPr>
-        <w:spacing w:after="0" w:line="240" w:lineRule="auto"/>
-        <w:jc w:val="both"/>
-        <w:rPr>
-          <w:rFonts w:ascii="TH Sarabun New" w:hAnsi="TH Sarabun New" w:cs="TH Sarabun New"/>
-          <w:sz w:val="16"/>
-          <w:szCs w:val="16"/>
-        </w:rPr>
-      </w:pPr>
-      <w:r>
-        <w:rPr>
-          <w:rFonts w:ascii="TH Sarabun New" w:hAnsi="TH Sarabun New" w:cs="TH Sarabun New"/>
           <w:noProof/>
           <w:sz w:val="16"/>
           <w:szCs w:val="16"/>
@@ -20717,15 +20761,15 @@
         <mc:AlternateContent>
           <mc:Choice Requires="wpg">
             <w:drawing>
-              <wp:anchor distT="0" distB="0" distL="114300" distR="114300" simplePos="0" relativeHeight="251836416" behindDoc="1" locked="0" layoutInCell="1" allowOverlap="1" wp14:anchorId="67F6FCEF" wp14:editId="25DF2717">
+              <wp:anchor distT="0" distB="0" distL="114300" distR="114300" simplePos="0" relativeHeight="251836416" behindDoc="1" locked="0" layoutInCell="1" allowOverlap="1" wp14:anchorId="67F6FCEF" wp14:editId="203C4F12">
                 <wp:simplePos x="0" y="0"/>
                 <wp:positionH relativeFrom="column">
-                  <wp:posOffset>23052</wp:posOffset>
+                  <wp:posOffset>22860</wp:posOffset>
                 </wp:positionH>
                 <wp:positionV relativeFrom="paragraph">
-                  <wp:posOffset>76931</wp:posOffset>
+                  <wp:posOffset>207171</wp:posOffset>
                 </wp:positionV>
-                <wp:extent cx="5815173" cy="1045029"/>
+                <wp:extent cx="5814695" cy="1044575"/>
                 <wp:effectExtent l="0" t="0" r="0" b="3175"/>
                 <wp:wrapNone/>
                 <wp:docPr id="2068969731" name="Group 71"/>
@@ -20737,7 +20781,7 @@
                       <wpg:grpSpPr>
                         <a:xfrm>
                           <a:off x="0" y="0"/>
-                          <a:ext cx="5815173" cy="1045029"/>
+                          <a:ext cx="5814695" cy="1044575"/>
                           <a:chOff x="0" y="0"/>
                           <a:chExt cx="5942965" cy="865505"/>
                         </a:xfrm>
@@ -20837,7 +20881,7 @@
           </mc:Choice>
           <mc:Fallback>
             <w:pict>
-              <v:group w14:anchorId="20177109" id="Group 71" o:spid="_x0000_s1026" style="position:absolute;margin-left:1.8pt;margin-top:6.05pt;width:457.9pt;height:82.3pt;z-index:-251480064;mso-width-relative:margin;mso-height-relative:margin" coordsize="59429,8655" o:gfxdata="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">
+              <v:group w14:anchorId="1B0EB07C" id="Group 71" o:spid="_x0000_s1026" style="position:absolute;margin-left:1.8pt;margin-top:16.3pt;width:457.85pt;height:82.25pt;z-index:-251480064;mso-width-relative:margin;mso-height-relative:margin" coordsize="59429,8655" o:gfxdata="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">
                 <v:roundrect id="Rectangle: Rounded Corners 70" o:spid="_x0000_s1027" style="position:absolute;width:59429;height:8655;visibility:visible;mso-wrap-style:square;v-text-anchor:middle" arcsize="10923f" o:gfxdata="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" fillcolor="#181825" stroked="f" strokeweight="1.5pt">
                   <v:stroke joinstyle="miter"/>
                 </v:roundrect>
@@ -20849,6 +20893,34 @@
           </mc:Fallback>
         </mc:AlternateContent>
       </w:r>
+      <w:r>
+        <w:rPr>
+          <w:rFonts w:ascii="TH Sarabun New" w:hAnsi="TH Sarabun New" w:cs="TH Sarabun New"/>
+          <w:color w:val="7030A0"/>
+          <w:sz w:val="28"/>
+          <w:szCs w:val="28"/>
+        </w:rPr>
+        <w:t>Code example</w:t>
+      </w:r>
+    </w:p>
+    <w:p>
+      <w:pPr>
+        <w:spacing w:after="0" w:line="240" w:lineRule="auto"/>
+        <w:jc w:val="both"/>
+        <w:rPr>
+          <w:rFonts w:ascii="TH Sarabun New" w:hAnsi="TH Sarabun New" w:cs="TH Sarabun New"/>
+          <w:sz w:val="4"/>
+          <w:szCs w:val="4"/>
+        </w:rPr>
+      </w:pPr>
+      <w:r>
+        <w:rPr>
+          <w:rFonts w:ascii="TH Sarabun New" w:hAnsi="TH Sarabun New" w:cs="TH Sarabun New"/>
+          <w:sz w:val="16"/>
+          <w:szCs w:val="16"/>
+        </w:rPr>
+        <w:t xml:space="preserve">          </w:t>
+      </w:r>
     </w:p>
     <w:p>
       <w:pPr>
@@ -21307,6 +21379,7 @@
       <w:r>
         <w:rPr>
           <w:rFonts w:ascii="TH Sarabun New" w:hAnsi="TH Sarabun New" w:cs="TH Sarabun New"/>
+          <w:noProof/>
           <w:sz w:val="32"/>
           <w:szCs w:val="32"/>
         </w:rPr>
@@ -21494,6 +21567,7 @@
       <w:r>
         <w:rPr>
           <w:rFonts w:ascii="TH Sarabun New" w:hAnsi="TH Sarabun New" w:cs="TH Sarabun New"/>
+          <w:noProof/>
           <w:sz w:val="32"/>
           <w:szCs w:val="32"/>
         </w:rPr>
@@ -21825,6 +21899,9 @@
         <w:pStyle w:val="Heading2"/>
       </w:pPr>
       <w:r>
+        <w:rPr>
+          <w:noProof/>
+        </w:rPr>
         <w:lastRenderedPageBreak/>
         <w:drawing>
           <wp:anchor distT="0" distB="0" distL="114300" distR="114300" simplePos="0" relativeHeight="251841536" behindDoc="0" locked="0" layoutInCell="1" allowOverlap="1" wp14:anchorId="4B0BFC83" wp14:editId="298814A1">
@@ -21897,6 +21974,9 @@
       <w:r>
         <w:t>src/main/java/logic/</w:t>
       </w:r>
+      <w:r>
+        <w:t>interfaces</w:t>
+      </w:r>
     </w:p>
     <w:p>
       <w:pPr>
@@ -22100,6 +22180,9 @@
         <w:pStyle w:val="Heading2"/>
       </w:pPr>
       <w:r>
+        <w:rPr>
+          <w:noProof/>
+        </w:rPr>
         <w:lastRenderedPageBreak/>
         <w:drawing>
           <wp:anchor distT="0" distB="0" distL="114300" distR="114300" simplePos="0" relativeHeight="251842560" behindDoc="0" locked="0" layoutInCell="1" allowOverlap="1" wp14:anchorId="71DEA69C" wp14:editId="63570D14">
@@ -22350,10 +22433,7 @@
         <w:t>src/main/java/logic/</w:t>
       </w:r>
       <w:r>
-        <w:t>DamageText</w:t>
-      </w:r>
-      <w:r>
-        <w:t xml:space="preserve">.java </w:t>
+        <w:t xml:space="preserve">DamageText.java </w:t>
       </w:r>
     </w:p>
     <w:p>
@@ -22366,6 +22446,7 @@
       </w:pPr>
       <w:r>
         <w:rPr>
+          <w:noProof/>
           <w:sz w:val="16"/>
           <w:szCs w:val="16"/>
         </w:rPr>
@@ -22775,31 +22856,7 @@
             <w:sz w:val="32"/>
             <w:szCs w:val="32"/>
           </w:rPr>
-          <w:t>Click here to view Ja</w:t>
-        </w:r>
-        <w:r>
-          <w:rPr>
-            <w:rStyle w:val="Hyperlink"/>
-            <w:rFonts w:ascii="TH Sarabun New" w:hAnsi="TH Sarabun New" w:cs="TH Sarabun New"/>
-            <w:b/>
-            <w:bCs/>
-            <w:color w:val="156082" w:themeColor="accent1"/>
-            <w:sz w:val="32"/>
-            <w:szCs w:val="32"/>
-          </w:rPr>
-          <w:t>v</w:t>
-        </w:r>
-        <w:r>
-          <w:rPr>
-            <w:rStyle w:val="Hyperlink"/>
-            <w:rFonts w:ascii="TH Sarabun New" w:hAnsi="TH Sarabun New" w:cs="TH Sarabun New"/>
-            <w:b/>
-            <w:bCs/>
-            <w:color w:val="156082" w:themeColor="accent1"/>
-            <w:sz w:val="32"/>
-            <w:szCs w:val="32"/>
-          </w:rPr>
-          <w:t>aDoc</w:t>
+          <w:t>Click here to view JavaDoc</w:t>
         </w:r>
       </w:hyperlink>
     </w:p>
@@ -28295,6 +28352,7 @@
   <w:style w:type="character" w:default="1" w:styleId="DefaultParagraphFont">
     <w:name w:val="Default Paragraph Font"/>
     <w:uiPriority w:val="1"/>
+    <w:semiHidden/>
     <w:unhideWhenUsed/>
   </w:style>
   <w:style w:type="table" w:default="1" w:styleId="TableNormal">

</xml_diff>